<commit_message>
Update website content and optimized media
Co-authored-by: Cursor <cursoragent@cursor.com>
</commit_message>
<xml_diff>
--- a/Aul-Bilim-Website-Copy.docx
+++ b/Aul-Bilim-Website-Copy.docx
@@ -378,50 +378,6 @@
                 <w:sz w:val="20"/>
                 <w:szCs w:val="20"/>
               </w:rPr>
-              <w:t xml:space="preserve">Серіктес болу →</w:t>
-            </w:r>
-          </w:p>
-        </w:tc>
-        <w:tc>
-          <w:tcPr>
-            <w:tcW w:type="pct" w:w="50%"/>
-            <w:shd w:fill="FFFFFF" w:val="clear"/>
-            <w:tcMar>
-              <w:top w:type="dxa" w:w="80"/>
-              <w:left w:type="dxa" w:w="120"/>
-              <w:bottom w:type="dxa" w:w="80"/>
-              <w:right w:type="dxa" w:w="120"/>
-            </w:tcMar>
-          </w:tcPr>
-          <w:p>
-            <w:r>
-              <w:rPr>
-                <w:sz w:val="20"/>
-                <w:szCs w:val="20"/>
-              </w:rPr>
-              <w:t xml:space="preserve">Become a Partner →</w:t>
-            </w:r>
-          </w:p>
-        </w:tc>
-      </w:tr>
-      <w:tr>
-        <w:tc>
-          <w:tcPr>
-            <w:tcW w:type="pct" w:w="50%"/>
-            <w:shd w:fill="FFFFFF" w:val="clear"/>
-            <w:tcMar>
-              <w:top w:type="dxa" w:w="80"/>
-              <w:left w:type="dxa" w:w="120"/>
-              <w:bottom w:type="dxa" w:w="80"/>
-              <w:right w:type="dxa" w:w="120"/>
-            </w:tcMar>
-          </w:tcPr>
-          <w:p>
-            <w:r>
-              <w:rPr>
-                <w:sz w:val="20"/>
-                <w:szCs w:val="20"/>
-              </w:rPr>
               <w:t xml:space="preserve">ҚАЗ</w:t>
             </w:r>
           </w:p>
@@ -9312,50 +9268,6 @@
                 <w:sz w:val="20"/>
                 <w:szCs w:val="20"/>
               </w:rPr>
-              <w:t xml:space="preserve">Серіктес болу →</w:t>
-            </w:r>
-          </w:p>
-        </w:tc>
-        <w:tc>
-          <w:tcPr>
-            <w:tcW w:type="pct" w:w="50%"/>
-            <w:shd w:fill="FFFFFF" w:val="clear"/>
-            <w:tcMar>
-              <w:top w:type="dxa" w:w="80"/>
-              <w:left w:type="dxa" w:w="120"/>
-              <w:bottom w:type="dxa" w:w="80"/>
-              <w:right w:type="dxa" w:w="120"/>
-            </w:tcMar>
-          </w:tcPr>
-          <w:p>
-            <w:r>
-              <w:rPr>
-                <w:sz w:val="20"/>
-                <w:szCs w:val="20"/>
-              </w:rPr>
-              <w:t xml:space="preserve">Become a Partner →</w:t>
-            </w:r>
-          </w:p>
-        </w:tc>
-      </w:tr>
-      <w:tr>
-        <w:tc>
-          <w:tcPr>
-            <w:tcW w:type="pct" w:w="50%"/>
-            <w:shd w:fill="FFFFFF" w:val="clear"/>
-            <w:tcMar>
-              <w:top w:type="dxa" w:w="80"/>
-              <w:left w:type="dxa" w:w="120"/>
-              <w:bottom w:type="dxa" w:w="80"/>
-              <w:right w:type="dxa" w:w="120"/>
-            </w:tcMar>
-          </w:tcPr>
-          <w:p>
-            <w:r>
-              <w:rPr>
-                <w:sz w:val="20"/>
-                <w:szCs w:val="20"/>
-              </w:rPr>
               <w:t xml:space="preserve">Қор туралы →</w:t>
             </w:r>
           </w:p>
@@ -11444,50 +11356,6 @@
                 <w:sz w:val="20"/>
                 <w:szCs w:val="20"/>
               </w:rPr>
-              <w:t xml:space="preserve">Серіктес болу →</w:t>
-            </w:r>
-          </w:p>
-        </w:tc>
-        <w:tc>
-          <w:tcPr>
-            <w:tcW w:type="pct" w:w="50%"/>
-            <w:shd w:fill="FFFFFF" w:val="clear"/>
-            <w:tcMar>
-              <w:top w:type="dxa" w:w="80"/>
-              <w:left w:type="dxa" w:w="120"/>
-              <w:bottom w:type="dxa" w:w="80"/>
-              <w:right w:type="dxa" w:w="120"/>
-            </w:tcMar>
-          </w:tcPr>
-          <w:p>
-            <w:r>
-              <w:rPr>
-                <w:sz w:val="20"/>
-                <w:szCs w:val="20"/>
-              </w:rPr>
-              <w:t xml:space="preserve">Become a Partner →</w:t>
-            </w:r>
-          </w:p>
-        </w:tc>
-      </w:tr>
-      <w:tr>
-        <w:tc>
-          <w:tcPr>
-            <w:tcW w:type="pct" w:w="50%"/>
-            <w:shd w:fill="FFFFFF" w:val="clear"/>
-            <w:tcMar>
-              <w:top w:type="dxa" w:w="80"/>
-              <w:left w:type="dxa" w:w="120"/>
-              <w:bottom w:type="dxa" w:w="80"/>
-              <w:right w:type="dxa" w:w="120"/>
-            </w:tcMar>
-          </w:tcPr>
-          <w:p>
-            <w:r>
-              <w:rPr>
-                <w:sz w:val="20"/>
-                <w:szCs w:val="20"/>
-              </w:rPr>
               <w:t xml:space="preserve">Оқиғаларды көру →</w:t>
             </w:r>
           </w:p>
@@ -13427,50 +13295,6 @@
                 <w:sz w:val="20"/>
                 <w:szCs w:val="20"/>
               </w:rPr>
-              <w:t xml:space="preserve">Серіктес болу →</w:t>
-            </w:r>
-          </w:p>
-        </w:tc>
-        <w:tc>
-          <w:tcPr>
-            <w:tcW w:type="pct" w:w="50%"/>
-            <w:shd w:fill="FFFFFF" w:val="clear"/>
-            <w:tcMar>
-              <w:top w:type="dxa" w:w="80"/>
-              <w:left w:type="dxa" w:w="120"/>
-              <w:bottom w:type="dxa" w:w="80"/>
-              <w:right w:type="dxa" w:w="120"/>
-            </w:tcMar>
-          </w:tcPr>
-          <w:p>
-            <w:r>
-              <w:rPr>
-                <w:sz w:val="20"/>
-                <w:szCs w:val="20"/>
-              </w:rPr>
-              <w:t xml:space="preserve">Become a Partner →</w:t>
-            </w:r>
-          </w:p>
-        </w:tc>
-      </w:tr>
-      <w:tr>
-        <w:tc>
-          <w:tcPr>
-            <w:tcW w:type="pct" w:w="50%"/>
-            <w:shd w:fill="FFFFFF" w:val="clear"/>
-            <w:tcMar>
-              <w:top w:type="dxa" w:w="80"/>
-              <w:left w:type="dxa" w:w="120"/>
-              <w:bottom w:type="dxa" w:w="80"/>
-              <w:right w:type="dxa" w:w="120"/>
-            </w:tcMar>
-          </w:tcPr>
-          <w:p>
-            <w:r>
-              <w:rPr>
-                <w:sz w:val="20"/>
-                <w:szCs w:val="20"/>
-              </w:rPr>
               <w:t xml:space="preserve">Бағдарламалар →</w:t>
             </w:r>
           </w:p>
@@ -15537,50 +15361,6 @@
                 <w:szCs w:val="20"/>
               </w:rPr>
               <w:t xml:space="preserve">Donor, partner or volunteer — there are many ways to join Aul Bilim. Let's figure out where you fit, together.</w:t>
-            </w:r>
-          </w:p>
-        </w:tc>
-      </w:tr>
-      <w:tr>
-        <w:tc>
-          <w:tcPr>
-            <w:tcW w:type="pct" w:w="50%"/>
-            <w:shd w:fill="FFFFFF" w:val="clear"/>
-            <w:tcMar>
-              <w:top w:type="dxa" w:w="80"/>
-              <w:left w:type="dxa" w:w="120"/>
-              <w:bottom w:type="dxa" w:w="80"/>
-              <w:right w:type="dxa" w:w="120"/>
-            </w:tcMar>
-          </w:tcPr>
-          <w:p>
-            <w:r>
-              <w:rPr>
-                <w:sz w:val="20"/>
-                <w:szCs w:val="20"/>
-              </w:rPr>
-              <w:t xml:space="preserve">Серіктес болу →</w:t>
-            </w:r>
-          </w:p>
-        </w:tc>
-        <w:tc>
-          <w:tcPr>
-            <w:tcW w:type="pct" w:w="50%"/>
-            <w:shd w:fill="FFFFFF" w:val="clear"/>
-            <w:tcMar>
-              <w:top w:type="dxa" w:w="80"/>
-              <w:left w:type="dxa" w:w="120"/>
-              <w:bottom w:type="dxa" w:w="80"/>
-              <w:right w:type="dxa" w:w="120"/>
-            </w:tcMar>
-          </w:tcPr>
-          <w:p>
-            <w:r>
-              <w:rPr>
-                <w:sz w:val="20"/>
-                <w:szCs w:val="20"/>
-              </w:rPr>
-              <w:t xml:space="preserve">Become a Partner →</w:t>
             </w:r>
           </w:p>
         </w:tc>

</xml_diff>